<commit_message>
structure: adopt course layout (data/raw, report.pdf, AI_USE_DISCLOSURE.md)
</commit_message>
<xml_diff>
--- a/report/empirical_report.docx
+++ b/report/empirical_report.docx
@@ -140,7 +140,7 @@
         <w:rPr>
           <w:rStyle w:val="VerbatimChar"/>
         </w:rPr>
-        <w:t xml:space="preserve">data/input/public.csv</w:t>
+        <w:t xml:space="preserve">data/raw/public.csv</w:t>
       </w:r>
       <w:r>
         <w:t xml:space="preserve">.</w:t>
@@ -6023,7 +6023,7 @@
         <w:rPr>
           <w:rStyle w:val="VerbatimChar"/>
         </w:rPr>
-        <w:t xml:space="preserve">data/input/public.csv</w:t>
+        <w:t xml:space="preserve">data/raw/public.csv</w:t>
       </w:r>
       <w:r>
         <w:t xml:space="preserve"> </w:t>

</xml_diff>